<commit_message>
Actualizacion automatica - 2026-03-02 14:08 hora Guatemala
</commit_message>
<xml_diff>
--- a/2_Results/20260302/Boletin_Sipacate_BO020326.docx
+++ b/2_Results/20260302/Boletin_Sipacate_BO020326.docx
@@ -358,7 +358,7 @@
         <w:t xml:space="preserve">Lunes 2 de marzo: </w:t>
       </w:r>
       <w:r>
-        <w:t>Se identifica una alta variabilidad del viento durante la madrugada y las primeras horas de la mañana (00:00 - 06:00), con el viento soplando frecuentemente en la zona no favorable, es decir hacia el sur. A partir de las 07:00 horas, la dirección se consolida dentro de la zona favorable (90° a 270°) en ambos niveles de altura (10 y 100 metros), manteniendo estabilidad durante la tarde hasta las 22:00 horas aproximadamente. El comportamiento vuelve a mostrar variaciones hacia la zona roja después de las 22:00 horas.</w:t>
+        <w:t>Se identifica una alta variabilidad del viento durante la madrugada y las primeras horas de la mañana (00:00 - 08:00), con el viento soplando frecuentemente en la zona no favorable, es decir hacia el sur. A partir de las 09:00 horas, la dirección se consolida dentro de la zona favorable (90° a 270°) en ambos niveles de altura (10 y 100 metros), manteniendo estabilidad durante la tarde hasta las 22:00 horas aproximadamente. El comportamiento vuelve a mostrar variaciones hacia la zona roja después de las 22:00 horas.</w:t>
       </w:r>
     </w:p>
     <w:p>
@@ -415,7 +415,7 @@
         <w:t xml:space="preserve">Lunes 2 de marzo: </w:t>
       </w:r>
       <w:r>
-        <w:t>Las velocidades promedio del viento se registran en 7.3 km/h a 10 metros de altura y 11.4 km/h a 100 metros. Las velocidades máximas alcanzan 18.6 km/h alrededor de las 14:00 horas a 10 metros de altura, indicando condiciones de viento moderado durante este periodo. Se pronostican velocidades por encima de 10 km/h durante 7 horas del día, principalmente entre las 11:00 y 17:00 horas. Se observa un incremento significativo de las velocidades durante la tarde, pasando de 3.3 km/h en la mañana a 14.0 km/h en la tarde. Se observa una diferencia notable entre niveles, con velocidades 4.2 km/h más altas a 100 metros de altura, lo cual es característico del perfil vertical del viento.</w:t>
+        <w:t>Las velocidades promedio del viento se registran en 7.9 km/h a 10 metros de altura y 12.4 km/h a 100 metros. Las velocidades máximas alcanzan 20.0 km/h alrededor de las 15:00 horas a 10 metros de altura, indicando condiciones de viento moderado a fuerte durante este periodo. Se pronostican velocidades por encima de 10 km/h durante 8 horas del día, principalmente entre las 11:00 y 18:00 horas. Se observa un incremento significativo de las velocidades durante la tarde, pasando de 3.6 km/h en la mañana a 15.4 km/h en la tarde. Se observa una diferencia notable entre niveles, con velocidades 4.5 km/h más altas a 100 metros de altura, lo cual es característico del perfil vertical del viento.</w:t>
       </w:r>
     </w:p>
     <w:p>
@@ -430,7 +430,7 @@
         <w:t xml:space="preserve">Martes 3 de marzo: </w:t>
       </w:r>
       <w:r>
-        <w:t>Las velocidades promedio del viento se registran en 9.1 km/h a 10 metros de altura y 13.7 km/h a 100 metros. Las velocidades máximas alcanzan 19.1 km/h alrededor de las 16:00 horas a 10 metros de altura, indicando condiciones de viento moderado durante este periodo. Se pronostican velocidades por encima de 10 km/h durante 9 horas del día, principalmente entre las 11:00 y 19:00 horas. Se observa un incremento significativo de las velocidades durante la tarde, pasando de 4.3 km/h en la mañana a 16.5 km/h en la tarde. Se observa una diferencia notable entre niveles, con velocidades 4.6 km/h más altas a 100 metros de altura, lo cual es característico del perfil vertical del viento.</w:t>
+        <w:t>Las velocidades promedio del viento se registran en 8.9 km/h a 10 metros de altura y 13.4 km/h a 100 metros. Las velocidades máximas alcanzan 19.7 km/h alrededor de las 16:00 horas a 10 metros de altura, indicando condiciones de viento moderado durante este periodo. Se pronostican velocidades por encima de 10 km/h durante 9 horas del día, principalmente entre las 11:00 y 19:00 horas. Se observa un incremento significativo de las velocidades durante la tarde, pasando de 4.2 km/h en la mañana a 16.2 km/h en la tarde. Se observa una diferencia notable entre niveles, con velocidades 4.5 km/h más altas a 100 metros de altura, lo cual es característico del perfil vertical del viento.</w:t>
       </w:r>
     </w:p>
     <w:p>
@@ -445,7 +445,7 @@
         <w:t xml:space="preserve">Miércoles 4 de marzo: </w:t>
       </w:r>
       <w:r>
-        <w:t>Las velocidades promedio del viento se registran en 7.6 km/h a 10 metros de altura y 10.7 km/h a 100 metros. Las velocidades máximas alcanzan 16.2 km/h alrededor de las 12:00 horas a 10 metros de altura, indicando condiciones de viento moderado durante este periodo. Se pronostican velocidades por encima de 10 km/h durante 10 horas del día, principalmente entre las 10:00 y 19:00 horas. Se observa un incremento significativo de las velocidades durante la tarde, pasando de 3.0 km/h en la mañana a 14.4 km/h en la tarde.</w:t>
+        <w:t>Las velocidades promedio del viento se registran en 7.5 km/h a 10 metros de altura y 10.8 km/h a 100 metros. Las velocidades máximas alcanzan 17.2 km/h alrededor de las 13:00 horas a 10 metros de altura, indicando condiciones de viento moderado durante este periodo. Se pronostican velocidades por encima de 10 km/h durante 9 horas del día, principalmente entre las 11:00 y 19:00 horas. Se observa un incremento significativo de las velocidades durante la tarde, pasando de 2.8 km/h en la mañana a 14.2 km/h en la tarde.</w:t>
       </w:r>
     </w:p>
     <w:sectPr>

</xml_diff>